<commit_message>
Vektoripaja: vaihe 3 – Börjen korjaukset ja lataukset
- Börje: 37 kielenhuoltokorjausta (yksi toiminto per virke, merkitys
  ennen termiä, lyhenteiden korvaamisen jäänteet).
- Sanasto: ortografisen näkymän harhaanjohtava rinnakkaisnimi pois,
  kysymystila eli Ask-tila, testi 24 = "seuraava toiminto".
- Vaatimusnimet ilman sisäistä ja-sanaa: tiedon käsittely, julkaisu
  tuotantoon, julkaisu asiakkaalle; viikon 9 esimerkki matriisin
  sanamuodolla.
- Viikkovälit: p3 41, 43–50 ja 3–5; p6 47–48; tagit harjoitus v0.0.41 ja
  viikkoversiot v0.0.43–v0.0.49.
- Vk 44 lisätesti: vanhempaa ei ole siirretty, kierretty eikä skaalattu.
  Vk 47: valinta erikseen numerokentistä. JSON on tekstimuoto.
- Lataukset uudelleen: työpaketti docx+pdf ja näyttösuunnitelma.

tarkista.js: 0 virhettä.

Co-Authored-By: Claude Opus 5.5 <noreply@anthropic.com>
</commit_message>
<xml_diff>
--- a/vektoripaja/downloads/nayttosuunnitelma.docx
+++ b/vektoripaja/downloads/nayttosuunnitelma.docx
@@ -115,7 +115,7 @@
           <w:sz w:val="21"/>
           <w:szCs w:val="21"/>
         </w:rPr>
-        <w:t xml:space="preserve">Pakollinen perusversio (P0, ennen joulua): SVG-tuonti · layerit ja ryhmät scene graphiksi · revolve 3–32 segmenttiä · inflate 3–8 sivua · valinta, siirto, kierto ja skaalaus, lapset seuraavat, pivot keskipisteessä ja prosentteina · orbit, suorat näkymät orientaatiokuutiosta ja view lock -painike · .obj-vienti osat erillisinä · tallennus ja avaus JSONina. P1: Päivitä SVG, kulmasnappaus, PiP, kierron kohderajaukset, oma teema ja isot kahvat, ortografinen näkymä, view lockin pikanäppäin.</w:t>
+        <w:t xml:space="preserve">Pakollinen ydin (P0, ennen joulua): SVG-tuonti · layerit ja ryhmät solmupuuksi · revolve 3–32 segmenttiä · inflate 3–8 sivua · valinta, siirto, kierto ja skaalaus, lapset seuraavat, pivot keskipisteessä ja prosentteina · orbit, suorat näkymät orientaatiowidgetistä ja view lock -painike · .obj-vienti osat erillisinä · tallennus ja avaus JSONina. Tärkeä jatko (P1): Päivitä SVG, kulmasnappaus, pieni esikatseluikkuna (PiP), kierron kohderajaukset, oma teema ja isot kahvat, ortografinen näkymä, view lockin pikanäppäin.</w:t>
       </w:r>
     </w:p>
     <w:p>
@@ -245,7 +245,7 @@
                 <w:sz w:val="19"/>
                 <w:szCs w:val="19"/>
               </w:rPr>
-              <w:t xml:space="preserve">Viikkopalaveri ma tai ti (sovitut kortit issue-kommentteina, edellisen viikon funktio ääneen), P0-tarkistuspiste vk 47, vikatehtävä tarvittaessa, ohjaajan päätökset (tekijänimi, lisenssi, krediitit, katselmoinnin kirjaustapa, julkaisutestaaja, arviointi). Toimii tiimin jäsenen roolissa vk 2:n ratkaisuarviossa.</w:t>
+              <w:t xml:space="preserve">Viikkopalaveri ma tai ti (sovitut kortit issue-kommentteina, edellisen viikon funktio ääneen), pakollisen ytimen (P0) tarkistuspiste vk 47, vikatehtävä tarvittaessa, ohjaajan päätökset (tekijänimi, lisenssi, krediitit, katselmoinnin kirjaustapa, julkaisutestaaja, arviointi). Toimii tiimin jäsenen roolissa vk 2:n ratkaisuarviossa.</w:t>
             </w:r>
           </w:p>
         </w:tc>
@@ -296,7 +296,7 @@
                 <w:sz w:val="19"/>
                 <w:szCs w:val="19"/>
               </w:rPr>
-              <w:t xml:space="preserve">Vastaavat kysymyslistaan vk 40–41, katselmoivat MVP:n vk 51 ja antavat P1-prioriteetit. Vk 7 Antti vahvistaa, että v1.0-release toimii hänen Windows-koneellaan; Matti (Mac) vahvistaa demon tai opiskelijan koneen kautta. Kun Matti toimii asiakkaana, se kerrotaan tehtävässä.</w:t>
+              <w:t xml:space="preserve">Vastaavat kysymyslistaan vk 40–41, katselmoivat MVP:n vk 51 ja antavat tärkeän jatkon (P1) prioriteetit. Vk 7 Antti vahvistaa, että v1.0-release toimii hänen Windows-koneellaan; Matti (Mac) vahvistaa demon tai opiskelijan koneen kautta. Kun Matti toimii asiakkaana, se kerrotaan tehtävässä.</w:t>
             </w:r>
           </w:p>
         </w:tc>
@@ -667,7 +667,7 @@
                 <w:sz w:val="19"/>
                 <w:szCs w:val="19"/>
               </w:rPr>
-              <w:t xml:space="preserve">Kaksi issueta syklin tarkistuslistoineen, T01:n oma arvo testikoodissa ennen toteutusta, tarkista_ymparisto.py läpi, release-zip v0.0.1 purettuna käynnistyy (T02) ja itsetesti läpi Actionsissa, päätös teknisestä pohjasta B-osiossa.</w:t>
+              <w:t xml:space="preserve">Kaksi issueta syklin tarkistuslistoineen, testin 1 (T01) oma arvo testikoodissa ennen toteutusta, tarkista_ymparisto.py läpi, release-zip v0.0.41 purettuna käynnistyy (testi 2, T02) ja itsetesti läpi Actionsissa, päätös teknisestä pohjasta B-osiossa.</w:t>
             </w:r>
           </w:p>
         </w:tc>
@@ -715,7 +715,7 @@
                 <w:sz w:val="19"/>
                 <w:szCs w:val="19"/>
               </w:rPr>
-              <w:t xml:space="preserve">Hierarkia ja kaista C</w:t>
+              <w:t xml:space="preserve">Hierarkia ja Agentti-kaista (C)</w:t>
             </w:r>
           </w:p>
         </w:tc>
@@ -738,7 +738,7 @@
                 <w:sz w:val="19"/>
                 <w:szCs w:val="19"/>
               </w:rPr>
-              <w:t xml:space="preserve">T06–T08, puhdas muunnosfunktio rajapintoineen, hierarkiapaneeli, valinnan toiminta B-osiossa. Kaista C:n krediittikulutus kirjattuna.</w:t>
+              <w:t xml:space="preserve">Testit 6–8 (T06–T08), puhdas muunnosfunktio rajapintoineen, maailmamuunnos puhtaana funktiona lisätesteineen, hierarkiapaneeli (QTreeWidget), valinnan toiminta B-osiossa. Agentti-kaistan (C) krediittikulutus kirjattuna.</w:t>
             </w:r>
           </w:p>
         </w:tc>
@@ -786,7 +786,7 @@
                 <w:sz w:val="19"/>
                 <w:szCs w:val="19"/>
               </w:rPr>
-              <w:t xml:space="preserve">P0-tarkistuspiste</w:t>
+              <w:t xml:space="preserve">Pakollisen ytimen (P0) tarkistuspiste</w:t>
             </w:r>
           </w:p>
         </w:tc>
@@ -809,7 +809,7 @@
                 <w:sz w:val="19"/>
                 <w:szCs w:val="19"/>
               </w:rPr>
-              <w:t xml:space="preserve">Onko P0 aikataulussa? Jos ei, ohjaaja päättää, mikä katselmoidaan keskeneräisenä ja mikä tehdään vk 4:llä omassa haarassa pull requestilla.</w:t>
+              <w:t xml:space="preserve">Onko pakollinen ydin aikataulussa? Jos ei, ohjaaja päättää, mikä katselmoidaan keskeneräisenä ja mikä tehdään vk 4:llä omassa haarassa pull requestilla.</w:t>
             </w:r>
           </w:p>
         </w:tc>
@@ -880,7 +880,7 @@
                 <w:sz w:val="19"/>
                 <w:szCs w:val="19"/>
               </w:rPr>
-              <w:t xml:space="preserve">T19–T20, o-rivit ja Blender, ensimmäinen virheenkorjausketju kuudella osalla ja regressiotestillä. Vikatehtävä, jos aitoa havaintoa ei ole.</w:t>
+              <w:t xml:space="preserve">Testit 19–20 (T19–T20), o-rivit trimeshin viennistä ja tarkistus Blenderissä, ensimmäinen virheenkorjausketju kuudella osalla ja regressiotestillä. Vikatehtävä, jos aitoa havaintoa ei ole.</w:t>
             </w:r>
           </w:p>
         </w:tc>
@@ -951,7 +951,7 @@
                 <w:sz w:val="19"/>
                 <w:szCs w:val="19"/>
               </w:rPr>
-              <w:t xml:space="preserve">Tallennusvertailu omilla kriteereillä, T21–T22, tietoturva-arvio, tagi v0.1 ja release-zip, itsetesti läpi.</w:t>
+              <w:t xml:space="preserve">Tallennusvertailu omilla kriteereillä, testit 21–22 (T21–T22), tietoturva-arvio, tagi v0.1 ja release-zip, itsetesti läpi.</w:t>
             </w:r>
           </w:p>
         </w:tc>
@@ -1093,7 +1093,7 @@
                 <w:sz w:val="19"/>
                 <w:szCs w:val="19"/>
               </w:rPr>
-              <w:t xml:space="preserve">Päivitä SVG omassa haarassa, T23, kaikki testit läpi ennen mergeä, pull request yhdistetty.</w:t>
+              <w:t xml:space="preserve">Päivitä SVG omassa haarassa, testi 23 (T23), kaikki testit läpi ennen mergeä, pull request yhdistetty.</w:t>
             </w:r>
           </w:p>
         </w:tc>
@@ -1671,7 +1671,7 @@
                 <w:sz w:val="19"/>
                 <w:szCs w:val="19"/>
               </w:rPr>
-              <w:t xml:space="preserve">T01–T26 ja lisätestit: odotettu tulos kirjoitettu itse testikoodiin ennen toteutusta, tulokset issueissa</w:t>
+              <w:t xml:space="preserve">Testit 1–26 (T01–T26) ja lisätestit, myös maailmamuunnoksen lisätesti vk 44: odotettu tulos kirjoitettu itse testikoodiin ennen toteutusta, tulokset issueissa</w:t>
             </w:r>
           </w:p>
         </w:tc>
@@ -1744,7 +1744,7 @@
                 <w:sz w:val="19"/>
                 <w:szCs w:val="19"/>
               </w:rPr>
-              <w:t xml:space="preserve">Rajapinta ennen toteutusta, selityspohja kolmesta funktiosta (hierarkian muunnos, pivotin syötteen tarkistus, OBJ-objektijako), selitys ääneen seuraavan viikon palaverissa (ohjaajan päätös 23.9.2026)</w:t>
+              <w:t xml:space="preserve">Rajapinta ennen toteutusta, selityspohja kolmesta funktiosta (hierarkian muunnos, pivotin syötteen tarkistus, OBJ-objektijako) sekä maailmamuunnos puhtaana funktiona (vk 44), selitys ääneen seuraavan viikon palaverissa (ohjaajan päätös 23.9.2026)</w:t>
             </w:r>
           </w:p>
         </w:tc>
@@ -1794,7 +1794,7 @@
                 <w:sz w:val="19"/>
                 <w:szCs w:val="19"/>
               </w:rPr>
-              <w:t xml:space="preserve">41, 44, 46, 48, 5</w:t>
+              <w:t xml:space="preserve">41, 44, 46, 47–48, 5</w:t>
             </w:r>
           </w:p>
         </w:tc>
@@ -1817,7 +1817,7 @@
                 <w:sz w:val="19"/>
                 <w:szCs w:val="19"/>
               </w:rPr>
-              <w:t xml:space="preserve">Hierarkiapaneeli, view lock, transformivalikko ja isot kahvat käyttöliittymävaatimuksen mukaan; Accessibility Insights ennen ja jälkeen</w:t>
+              <w:t xml:space="preserve">Hierarkiapaneeli, view lock, transformipaneeli (QDoubleSpinBox ja pikanäppäimet) ja isot kahvat käyttöliittymävaatimuksen mukaan; Accessibility Insights ennen ja jälkeen</w:t>
             </w:r>
           </w:p>
         </w:tc>
@@ -2109,7 +2109,7 @@
                 <w:sz w:val="19"/>
                 <w:szCs w:val="19"/>
               </w:rPr>
-              <w:t xml:space="preserve">Katselmointi asiakkaiden kanssa; ohjaaja tiimin roolissa arvioi MVP:n ratkaisut P1:tä varten</w:t>
+              <w:t xml:space="preserve">Katselmointi asiakkaiden kanssa; ohjaaja tiimin roolissa arvioi MVP:n ratkaisut tärkeää jatkoa (P1) varten</w:t>
             </w:r>
           </w:p>
         </w:tc>
@@ -2601,7 +2601,7 @@
                 <w:sz w:val="19"/>
                 <w:szCs w:val="19"/>
               </w:rPr>
-              <w:t xml:space="preserve">P0/P1/P2-karsinta perusteluineen, asiakkaiden prioriteetit, P1-järjestys</w:t>
+              <w:t xml:space="preserve">Karsinta pakolliseen ytimeen, tärkeään jatkoon ja jatkolistaan (P0/P1/P2) perusteluineen, asiakkaiden prioriteetit, tärkeän jatkon järjestys</w:t>
             </w:r>
           </w:p>
         </w:tc>
@@ -2747,7 +2747,7 @@
                 <w:sz w:val="19"/>
                 <w:szCs w:val="19"/>
               </w:rPr>
-              <w:t xml:space="preserve">Kaistan valinta ja toteuman vertailu RAPORTOI-askeleessa, krediittimittaus, P1-tuntiarviot</w:t>
+              <w:t xml:space="preserve">Kaistan valinta ja toteuman vertailu RAPORTOI-askeleessa, krediittimittaus, tärkeän jatkon (P1) tuntiarviot</w:t>
             </w:r>
           </w:p>
         </w:tc>
@@ -3112,7 +3112,7 @@
                 <w:sz w:val="19"/>
                 <w:szCs w:val="19"/>
               </w:rPr>
-              <w:t xml:space="preserve">T04 haitallinen SVG, T22 rikottu JSON, tietoturva-arvio uhka–testi–tulos–toimenpide</w:t>
+              <w:t xml:space="preserve">Testi 4 (T04): haitallinen SVG, testi 22 (T22): rikottu tallennus, tietoturva-arvio uhka–testi–tulos–toimenpide</w:t>
             </w:r>
           </w:p>
         </w:tc>
@@ -3185,7 +3185,7 @@
                 <w:sz w:val="19"/>
                 <w:szCs w:val="19"/>
               </w:rPr>
-              <w:t xml:space="preserve">Commitit rivillä Closes #N, tagit v0.1, v1.0-rc1 ja v1.0</w:t>
+              <w:t xml:space="preserve">Commitit rivillä Closes #N, tagit: harjoitus v0.0.41, viikkoversiot v0.0.43–v0.0.49, v0.1, v1.0-rc1 ja v1.0</w:t>
             </w:r>
           </w:p>
         </w:tc>
@@ -3308,7 +3308,7 @@
                 <w:sz w:val="19"/>
                 <w:szCs w:val="19"/>
               </w:rPr>
-              <w:t xml:space="preserve">41, 50, 7</w:t>
+              <w:t xml:space="preserve">41, 43–50, 7</w:t>
             </w:r>
           </w:p>
         </w:tc>
@@ -3331,7 +3331,7 @@
                 <w:sz w:val="19"/>
                 <w:szCs w:val="19"/>
               </w:rPr>
-              <w:t xml:space="preserve">Releasen rakentaminen ja julkaisu GitHub Actionsilla (PyInstaller, itsetesti, zip): harjoitus, MVP v0.1 ja v1.0</w:t>
+              <w:t xml:space="preserve">Releasen rakentaminen ja julkaisu GitHub Actionsilla (PyInstaller, itsetesti, zip): harjoitus v0.0.41, viikkoversiot v0.0.43–v0.0.49, MVP v0.1 ja v1.0</w:t>
             </w:r>
           </w:p>
         </w:tc>
@@ -4323,7 +4323,7 @@
           <w:sz w:val="20"/>
           <w:szCs w:val="20"/>
         </w:rPr>
-        <w:t xml:space="preserve">T01–T26 issueissa, kolme virheenkorjausketjua, kirjastot.md, tietoturva.md, Accessibility Insights ennen ja jälkeen.</w:t>
+        <w:t xml:space="preserve">Testit 1–26 (T01–T26) issueissa, kolme virheenkorjausketjua, kirjastot.md, tietoturva.md, Accessibility Insights ennen ja jälkeen.</w:t>
       </w:r>
     </w:p>
     <w:p>
@@ -4527,7 +4527,7 @@
           <w:sz w:val="21"/>
           <w:szCs w:val="21"/>
         </w:rPr>
-        <w:t xml:space="preserve">P0-tarkistuspiste vk 47</w:t>
+        <w:t xml:space="preserve">Pakollisen ytimen (P0) tarkistuspiste vk 47</w:t>
       </w:r>
     </w:p>
     <w:p>
@@ -4540,7 +4540,7 @@
           <w:sz w:val="20"/>
           <w:szCs w:val="20"/>
         </w:rPr>
-        <w:t xml:space="preserve">Jos P0 on myöhässä, ohjaaja päättää viikon 47 palaverissa, mikä katselmoidaan keskeneräisenä ja mikä tehdään vk 4:llä omassa haarassa pull requestilla.</w:t>
+        <w:t xml:space="preserve">Jos pakollinen ydin on myöhässä, ohjaaja päättää viikon 47 palaverissa, mikä katselmoidaan keskeneräisenä ja mikä tehdään vk 4:llä omassa haarassa pull requestilla.</w:t>
       </w:r>
     </w:p>
     <w:p>

</xml_diff>

<commit_message>
Selkeytä Vektoripajan kokonaiskuva ja viikko-ohjeet
</commit_message>
<xml_diff>
--- a/vektoripaja/downloads/nayttosuunnitelma.docx
+++ b/vektoripaja/downloads/nayttosuunnitelma.docx
@@ -26,7 +26,7 @@
           <w:sz w:val="23"/>
           <w:szCs w:val="23"/>
         </w:rPr>
-        <w:t xml:space="preserve">Vektoripaja · Low-poly 3D-mallinnin Windows-työpöytäsovelluksena (Python): Inkscapen SVG → 3D-malli → .obj. Tekoälyavusteinen työtapa: Copilot suunnittelee, GitHub Copilot toteuttaa. · Vk 40/2026–vk 9/2027 · syysloma vk 42 · joululoma 18.12.–10.1. · talviloma vk 8, luovutus pe 5.3.2027</w:t>
+        <w:t xml:space="preserve">Vektoripaja · Low-poly 3D-mallinnin Windows-työpöytäsovelluksena (Python): Inkscapen SVG → 3D-malli → .obj. Tekoälyavusteinen työtapa: Microsoft 365 Copilot suunnittelee ja auttaa Tiedosto-kaistalla. GitHub Copilot avustaa VS Codessa. · Vk 40/2026–vk 9/2027 · syysloma vk 42 · joululoma 18.12.–10.1. · talviloma vk 8, luovutus pe 5.3.2027</w:t>
       </w:r>
     </w:p>
     <w:p>
@@ -89,7 +89,7 @@
           <w:sz w:val="21"/>
           <w:szCs w:val="21"/>
         </w:rPr>
-        <w:t xml:space="preserve">Tekninen ympäristö: Python 3.13, PySide6 (Qt), PyVista ja pyvistaqt (VTK), trimesh ja numpy, svgelements, testit pytestillä. Julkaisu: GitHub Actions (windows-latest) tekee versiotagista PyInstallerilla Windows-version (onedir), ajaa pytestin ja valmiille .exe:lle itsetestin (--itsetesti) ja lisää zipin GitHubin releaseen. Valmis versio toimii ilman Pythonia. macOS-versiota ei tehdä. Opiskelija saa julkaisun, itsetestin ja kirjastolistan tiedostot viikon 41 pohjana (pohjat/vektoripaja-pohja.zip). Saavutettavuus mitataan Accessibility Insights for Windowsilla (FastPass), näppäimistötestillä ja Windowsin Lukijalla. Tekoälytyökalut: Microsoft 365 Copilot (BC, suunnittelu ja pilkkominen) ja GitHub Copilot (Student, toteutus VS Codessa). GitHub Copilotin budjetti on 200 krediittiä kuukaudessa.</w:t>
+        <w:t xml:space="preserve">Tekninen ympäristö: Python 3.13, PySide6 (Qt), PyVista ja pyvistaqt (VTK), trimesh ja numpy, svgelements, testit pytestillä. Julkaisu: GitHub Actions (windows-latest) tekee versiotagista PyInstallerilla Windows-version (onedir), ajaa pytestin ja valmiille .exe:lle itsetestin (--itsetesti) ja lisää zipin GitHubin releaseen. Valmis versio toimii ilman Pythonia. macOS-versiota ei tehdä. Opiskelija saa julkaisun, itsetestin ja kirjastolistan tiedostot viikon 41 pohjana (pohjat/vektoripaja-pohja.zip). Saavutettavuus mitataan Accessibility Insights for Windowsilla (FastPass), näppäimistötestillä ja Windowsin Lukijalla. Tekoälytyökalut: Microsoft 365 Copilot (BC, suunnittelu, pilkkominen ja Tiedosto-kaistan toteutus) ja GitHub Copilot (Student, toteutus VS Codessa). GitHub Copilotin budjetti on 200 krediittiä kuukaudessa.</w:t>
       </w:r>
     </w:p>
     <w:p>
@@ -115,7 +115,7 @@
           <w:sz w:val="21"/>
           <w:szCs w:val="21"/>
         </w:rPr>
-        <w:t xml:space="preserve">Pakollinen ydin (P0, ennen joulua): SVG-tuonti · layerit ja ryhmät solmupuuksi · revolve 3–32 segmenttiä · inflate 3–8 sivua · valinta, siirto, kierto ja skaalaus, lapset seuraavat, pivot keskipisteessä ja prosentteina · orbit, suorat näkymät orientaatiowidgetistä ja view lock -painike · .obj-vienti osat erillisinä · tallennus ja avaus JSONina. Tärkeä jatko (P1): Päivitä SVG, kulmasnappaus, pieni esikatseluikkuna (PiP), kierron kohderajaukset, oma teema ja isot kahvat, ortografinen näkymä, view lockin pikanäppäin.</w:t>
+        <w:t xml:space="preserve">Pakollinen ydin (P0, ennen joulua): SVG-tuonti · layerit ja ryhmät solmupuuksi · revolve 3–32 segmenttiä · inflate 3–8 sivua · valinta, siirto, kierto ja skaalaus, lapset seuraavat, pivot keskipisteessä ja prosentteina · orbit, suorat näkymät orientaatiowidgetistä ja view lock -painike · .obj-vienti osat erillisinä · tallennus ja avaus (JSON on ehdotus, valinta perustellaan viikolla 50). Tärkeä jatko (P1): Päivitä SVG, kulmasnappaus, pieni esikatseluikkuna (PiP), kierron kohderajaukset, oma teema ja isot kahvat, ortografinen näkymä, view lockin pikanäppäin.</w:t>
       </w:r>
     </w:p>
     <w:p>
@@ -596,7 +596,7 @@
                 <w:sz w:val="19"/>
                 <w:szCs w:val="19"/>
               </w:rPr>
-              <w:t xml:space="preserve">Versiot, julkinen repository noreply-sähköpostilla, ohjaaja Collaboratorina, kolme pohjatiedostoa, mvp.md omin sanoin, kysymyslista lähetetty, agenttipyynnön hinta kirjattu.</w:t>
+              <w:t xml:space="preserve">Versiot, julkinen repository noreply-sähköpostilla, ohjaaja Collaboratorina, kolme pohjatiedostoa, suunnitelma.md omin sanoin, kysymyslista lähetetty, agenttipyynnön hinta kirjattu.</w:t>
             </w:r>
           </w:p>
         </w:tc>
@@ -2893,7 +2893,7 @@
                 <w:sz w:val="19"/>
                 <w:szCs w:val="19"/>
               </w:rPr>
-              <w:t xml:space="preserve">Tallennustapojen vertailu oman suunnitelman kriteereillä ja oman mallin JSON-koko</w:t>
+              <w:t xml:space="preserve">Tallennustapojen vertailu oman suunnitelman kriteereillä ja oman mallin tallennustiedoston koko</w:t>
             </w:r>
           </w:p>
         </w:tc>
@@ -4296,7 +4296,7 @@
           <w:sz w:val="20"/>
           <w:szCs w:val="20"/>
         </w:rPr>
-        <w:t xml:space="preserve">project-docs/suunnitelma.md, mvp.md, kysymykset.md, projektipaivakirja.md ja AI-loki. Päiväkirjasta commit joka viikolta.</w:t>
+        <w:t xml:space="preserve">project-docs/suunnitelma.md, kysymykset.md, projektipaivakirja.md ja AI-loki. Päiväkirjasta commit joka viikolta.</w:t>
       </w:r>
     </w:p>
     <w:p>

</xml_diff>

<commit_message>
Vektoripaja: käyttöliittymävaatimus viikolle 43 ja pohjat uuden viikon 41 mukaisiksi
Viikon 41 uudistuksessa poistunut käyttöliittymävaatimus kirjataan nyt
työvaiheessa 43-12 (viikot 48 ja 5 lukevat sen). Teknisen pohjan otsikko
poistettu suunnitelmasta. Kysymysten vastaukset viikolle 43 pohjissa ja
ohjeissa, viikon 43 kirjaus ja vaatimuslista (s1) päivitetty, vanhat
v0.0.41-esimerkit ja opettaja-aineiston harjoitussykli korjattu.

Co-Authored-By: Claude Opus 5.5 <noreply@anthropic.com>
</commit_message>
<xml_diff>
--- a/vektoripaja/downloads/nayttosuunnitelma.docx
+++ b/vektoripaja/downloads/nayttosuunnitelma.docx
@@ -89,7 +89,7 @@
           <w:sz w:val="21"/>
           <w:szCs w:val="21"/>
         </w:rPr>
-        <w:t xml:space="preserve">Tekninen ympäristö: Python 3.13, PySide6 (Qt), PyVista ja pyvistaqt (VTK), trimesh ja numpy, svgelements, testit pytestillä. Julkaisu: GitHub Actions (windows-latest) tekee versiotagista PyInstallerilla Windows-version (onedir), ajaa pytestin ja valmiille .exe:lle itsetestin (--itsetesti) ja lisää zipin GitHubin releaseen. Valmis versio toimii ilman Pythonia. macOS-versiota ei tehdä. Opiskelija saa julkaisun, itsetestin ja kirjastolistan tiedostot viikon 41 pohjana (pohjat/vektoripaja-pohja.zip). Saavutettavuus mitataan Accessibility Insights for Windowsilla (FastPass), näppäimistötestillä ja Windowsin Lukijalla. Tekoälytyökalut: Microsoft 365 Copilot (BC, suunnittelu, pilkkominen ja Tiedosto-kaistan toteutus) ja GitHub Copilot (Student, toteutus VS Codessa). GitHub Copilotin budjetti on 200 krediittiä kuukaudessa.</w:t>
+        <w:t xml:space="preserve">Tekninen ympäristö: Python 3.13, PySide6 (Qt), PyVista ja pyvistaqt (VTK), trimesh ja numpy, svgelements, testit pytestillä. Julkaisu: GitHub Actions (windows-latest) tekee versiotagista PyInstallerilla Windows-version (onedir), ajaa pytestin ja valmiille .exe:lle itsetestin (--itsetesti) ja lisää zipin GitHubin releaseen. Valmis versio toimii ilman Pythonia. macOS-versiota ei tehdä. Opiskelija saa viikon 41 pohjana valmiin kuutiosovelluksen ja sen testin sekä julkaisun, itsetestin ja kirjastolistan tiedostot (pohjat/vektoripaja-pohja.zip). Saavutettavuus mitataan Accessibility Insights for Windowsilla (FastPass), näppäimistötestillä ja Windowsin Lukijalla. Tekoälytyökalut: Microsoft 365 Copilot (BC, suunnittelu, pilkkominen ja Tiedosto-kaistan toteutus) ja GitHub Copilot (Student, toteutus VS Codessa). GitHub Copilotin budjetti on 200 krediittiä kuukaudessa.</w:t>
       </w:r>
     </w:p>
     <w:p>
@@ -644,7 +644,7 @@
                 <w:sz w:val="19"/>
                 <w:szCs w:val="19"/>
               </w:rPr>
-              <w:t xml:space="preserve">Harjoitussykli</w:t>
+              <w:t xml:space="preserve">Työkalujen käyttöönotto</w:t>
             </w:r>
           </w:p>
         </w:tc>
@@ -667,7 +667,7 @@
                 <w:sz w:val="19"/>
                 <w:szCs w:val="19"/>
               </w:rPr>
-              <w:t xml:space="preserve">Kaksi issueta syklin tarkistuslistoineen, testin 1 (T01) oma arvo testikoodissa ennen toteutusta, tarkista_ymparisto.py läpi, release-zip v0.0.41 purettuna käynnistyy (testi 2, T02) ja itsetesti läpi Actionsissa, päätös teknisestä pohjasta B-osiossa.</w:t>
+              <w:t xml:space="preserve">tarkista_ymparisto.py näyttää Ympäristö on kunnossa, valmis kuutio pyörii, valmis testi test_1_kiertokulma ja itsetesti menevät läpi, ja tulokset ovat projektipäiväkirjassa. Ei tehtäväkortteja eikä releasea.</w:t>
             </w:r>
           </w:p>
         </w:tc>
@@ -3185,7 +3185,7 @@
                 <w:sz w:val="19"/>
                 <w:szCs w:val="19"/>
               </w:rPr>
-              <w:t xml:space="preserve">Commitit rivillä Closes #N, tagit: harjoitus v0.0.41, viikkoversiot v0.0.43–v0.0.49, v0.1, v1.0-rc1 ja v1.0</w:t>
+              <w:t xml:space="preserve">Commitit rivillä Closes #N, tagit: viikkoversiot v0.0.43–v0.0.49, v0.1, v1.0-rc1 ja v1.0</w:t>
             </w:r>
           </w:p>
         </w:tc>
@@ -3331,7 +3331,7 @@
                 <w:sz w:val="19"/>
                 <w:szCs w:val="19"/>
               </w:rPr>
-              <w:t xml:space="preserve">Releasen rakentaminen ja julkaisu GitHub Actionsilla (PyInstaller, itsetesti, zip): harjoitus v0.0.41, viikkoversiot v0.0.43–v0.0.49, MVP v0.1 ja v1.0</w:t>
+              <w:t xml:space="preserve">Releasen rakentaminen ja julkaisu GitHub Actionsilla (PyInstaller, itsetesti, zip): viikkoversiot v0.0.43–v0.0.49, MVP v0.1 ja v1.0</w:t>
             </w:r>
           </w:p>
         </w:tc>

</xml_diff>